<commit_message>
add X-Ray vpc endpoint, removed CloudWatch metrics vpc endpoint
</commit_message>
<xml_diff>
--- a/docs/System-design.docx
+++ b/docs/System-design.docx
@@ -451,7 +451,7 @@
           <w:noProof/>
         </w:rPr>
         <w:drawing>
-          <wp:inline distT="0" distB="0" distL="0" distR="0" wp14:anchorId="53424472" wp14:editId="7EBB3E8B">
+          <wp:inline distT="0" distB="0" distL="0" distR="0" wp14:anchorId="53424472" wp14:editId="5CFB4775">
             <wp:extent cx="5931535" cy="3991610"/>
             <wp:effectExtent l="0" t="0" r="0" b="8890"/>
             <wp:docPr id="2096260848" name="Picture 1"/>
@@ -1372,10 +1372,10 @@
           <w:noProof/>
         </w:rPr>
         <w:drawing>
-          <wp:inline distT="0" distB="0" distL="0" distR="0" wp14:anchorId="63CFC767" wp14:editId="1DCD15CD">
-            <wp:extent cx="5939790" cy="4309745"/>
-            <wp:effectExtent l="0" t="0" r="3810" b="0"/>
-            <wp:docPr id="289727937" name="Picture 2"/>
+          <wp:inline distT="0" distB="0" distL="0" distR="0" wp14:anchorId="00E1F53B" wp14:editId="6A926F53">
+            <wp:extent cx="5939790" cy="4316095"/>
+            <wp:effectExtent l="0" t="0" r="3810" b="8255"/>
+            <wp:docPr id="217624923" name="Picture 1"/>
             <wp:cNvGraphicFramePr>
               <a:graphicFrameLocks xmlns:a="http://schemas.openxmlformats.org/drawingml/2006/main" noChangeAspect="1"/>
             </wp:cNvGraphicFramePr>
@@ -1383,7 +1383,7 @@
               <a:graphicData uri="http://schemas.openxmlformats.org/drawingml/2006/picture">
                 <pic:pic xmlns:pic="http://schemas.openxmlformats.org/drawingml/2006/picture">
                   <pic:nvPicPr>
-                    <pic:cNvPr id="0" name="Picture 2"/>
+                    <pic:cNvPr id="0" name="Picture 1"/>
                     <pic:cNvPicPr>
                       <a:picLocks noChangeAspect="1" noChangeArrowheads="1"/>
                     </pic:cNvPicPr>
@@ -1404,7 +1404,7 @@
                   <pic:spPr bwMode="auto">
                     <a:xfrm>
                       <a:off x="0" y="0"/>
-                      <a:ext cx="5939790" cy="4309745"/>
+                      <a:ext cx="5939790" cy="4316095"/>
                     </a:xfrm>
                     <a:prstGeom prst="rect">
                       <a:avLst/>
@@ -1657,7 +1657,49 @@
         <w:rPr>
           <w:rFonts w:ascii="Aptos" w:hAnsi="Aptos"/>
         </w:rPr>
-        <w:t xml:space="preserve">All internal traffic stays off the public internet. The microservices communicate with S3, CloudWatch, Secrets Manager, and Amazon ECR exclusively via </w:t>
+        <w:t xml:space="preserve">All internal traffic stays off the public internet. The microservices communicate with S3, </w:t>
+      </w:r>
+      <w:r>
+        <w:rPr>
+          <w:rFonts w:ascii="Aptos" w:hAnsi="Aptos"/>
+        </w:rPr>
+        <w:t>Secrets Manager</w:t>
+      </w:r>
+      <w:r>
+        <w:rPr>
+          <w:rFonts w:ascii="Aptos" w:hAnsi="Aptos"/>
+        </w:rPr>
+        <w:t xml:space="preserve">, </w:t>
+      </w:r>
+      <w:r>
+        <w:rPr>
+          <w:rFonts w:ascii="Aptos" w:hAnsi="Aptos"/>
+        </w:rPr>
+        <w:t>CloudWatch</w:t>
+      </w:r>
+      <w:r>
+        <w:rPr>
+          <w:rFonts w:ascii="Aptos" w:hAnsi="Aptos"/>
+        </w:rPr>
+        <w:t xml:space="preserve"> logs</w:t>
+      </w:r>
+      <w:r>
+        <w:rPr>
+          <w:rFonts w:ascii="Aptos" w:hAnsi="Aptos"/>
+        </w:rPr>
+        <w:t xml:space="preserve">, </w:t>
+      </w:r>
+      <w:r>
+        <w:rPr>
+          <w:rFonts w:ascii="Aptos" w:hAnsi="Aptos"/>
+        </w:rPr>
+        <w:t>X-Ray</w:t>
+      </w:r>
+      <w:r>
+        <w:rPr>
+          <w:rFonts w:ascii="Aptos" w:hAnsi="Aptos"/>
+        </w:rPr>
+        <w:t xml:space="preserve"> and ECR exclusively via </w:t>
       </w:r>
       <w:proofErr w:type="spellStart"/>
       <w:r>

</xml_diff>